<commit_message>
new and updated files for the Guide Institute project, including an implementation roadmap and proposal documents in both Word and Markdown formats.
</commit_message>
<xml_diff>
--- a/projects/the-guide-institute/proposal.docx
+++ b/projects/the-guide-institute/proposal.docx
@@ -470,14 +470,14 @@
           <w:sz w:val="21"/>
           <w:szCs w:val="21"/>
         </w:rPr>
-        <w:t xml:space="preserve">Attracts the right families. </w:t>
-      </w:r>
-      <w:r>
-        <w:rPr>
-          <w:sz w:val="21"/>
-          <w:szCs w:val="21"/>
-        </w:rPr>
-        <w:t xml:space="preserve">Targeted Facebook, Instagram, and Google campaigns put The Guide Institute in front of exactly the parents and students looking for O/A-Level help in your area — with an irresistible free offer (a diagnostic test or trial class) that turns interest into an actual inquiry.</w:t>
+        <w:t xml:space="preserve">Attracts the right families — from three directions at once. </w:t>
+      </w:r>
+      <w:r>
+        <w:rPr>
+          <w:sz w:val="21"/>
+          <w:szCs w:val="21"/>
+        </w:rPr>
+        <w:t xml:space="preserve">We don't rely on a single source of leads. Your institute gets a complete lead-generation engine with three parts working together: (1) Advertising — targeted Facebook, Instagram, and Google campaigns with an irresistible free offer (diagnostic test or trial class); (2) Re-engagement — we automatically reach back out to your past inquiries, trial no-shows, and former students at the right moments (the fastest, lowest-cost students you'll ever win); and (3) School &amp; corporate partnerships — we proactively approach schools, companies (staff study benefits), and universities to set up referral partnerships, each of which can send you many students at once. Every lead, no matter the source, flows into the same system so nothing is ever handled twice or lost.</w:t>
       </w:r>
     </w:p>
     <w:p>
@@ -787,7 +787,7 @@
                 <w:sz w:val="20"/>
                 <w:szCs w:val="20"/>
               </w:rPr>
-              <w:t xml:space="preserve">Launch targeted ad campaigns for parents &amp; students + organic and referral engines</w:t>
+              <w:t xml:space="preserve">Launch the 3-engine lead system — ads, re-engagement of your existing contacts, and school/corporate partnership outreach</w:t>
             </w:r>
           </w:p>
         </w:tc>
@@ -804,7 +804,7 @@
                 <w:sz w:val="20"/>
                 <w:szCs w:val="20"/>
               </w:rPr>
-              <w:t xml:space="preserve">A consistent flow of qualified inquiries</w:t>
+              <w:t xml:space="preserve">A consistent, multi-source flow of qualified inquiries</w:t>
             </w:r>
           </w:p>
         </w:tc>
@@ -1117,7 +1117,70 @@
           <w:sz w:val="21"/>
           <w:szCs w:val="21"/>
         </w:rPr>
+        <w:t xml:space="preserve">A 3-engine lead-generation system: paid ads + re-engagement of your existing contacts + school/corporate partnership outreach</w:t>
+      </w:r>
+    </w:p>
+    <w:p>
+      <w:pPr>
+        <w:spacing w:after="40" w:line="264" w:lineRule="auto"/>
+        <w:ind w:left="360" w:hanging="360"/>
+      </w:pPr>
+      <w:r>
+        <w:rPr>
+          <w:color w:val="2E7D5B"/>
+          <w:sz w:val="21"/>
+          <w:szCs w:val="21"/>
+        </w:rPr>
+        <w:t xml:space="preserve">•  </w:t>
+      </w:r>
+      <w:r>
+        <w:rPr>
+          <w:sz w:val="21"/>
+          <w:szCs w:val="21"/>
+        </w:rPr>
         <w:t xml:space="preserve">Targeted ad campaigns (parent + student) with creative</w:t>
+      </w:r>
+    </w:p>
+    <w:p>
+      <w:pPr>
+        <w:spacing w:after="40" w:line="264" w:lineRule="auto"/>
+        <w:ind w:left="360" w:hanging="360"/>
+      </w:pPr>
+      <w:r>
+        <w:rPr>
+          <w:color w:val="2E7D5B"/>
+          <w:sz w:val="21"/>
+          <w:szCs w:val="21"/>
+        </w:rPr>
+        <w:t xml:space="preserve">•  </w:t>
+      </w:r>
+      <w:r>
+        <w:rPr>
+          <w:sz w:val="21"/>
+          <w:szCs w:val="21"/>
+        </w:rPr>
+        <w:t xml:space="preserve">A re-engagement campaign that revives your past inquiries and former students</w:t>
+      </w:r>
+    </w:p>
+    <w:p>
+      <w:pPr>
+        <w:spacing w:after="40" w:line="264" w:lineRule="auto"/>
+        <w:ind w:left="360" w:hanging="360"/>
+      </w:pPr>
+      <w:r>
+        <w:rPr>
+          <w:color w:val="2E7D5B"/>
+          <w:sz w:val="21"/>
+          <w:szCs w:val="21"/>
+        </w:rPr>
+        <w:t xml:space="preserve">•  </w:t>
+      </w:r>
+      <w:r>
+        <w:rPr>
+          <w:sz w:val="21"/>
+          <w:szCs w:val="21"/>
+        </w:rPr>
+        <w:t xml:space="preserve">A partnership outreach program (schools, companies, universities) with done-for-you email + call scripts</w:t>
       </w:r>
     </w:p>
     <w:p>

</xml_diff>